<commit_message>
Refine medicine encoding and vehicle request documents
</commit_message>
<xml_diff>
--- a/templates/Vehicle Use Request Form-Vehicle Use Agreement (Revised 04-23-2026).docx
+++ b/templates/Vehicle Use Request Form-Vehicle Use Agreement (Revised 04-23-2026).docx
@@ -61,13 +61,45 @@
       <w:pPr>
         <w:spacing w:after="9" w:line="259" w:lineRule="auto"/>
         <w:ind w:left="0" w:right="0" w:firstLine="0"/>
-        <w:jc w:val="left"/>
+        <w:jc w:val="center"/>
       </w:pPr>
       <w:r>
         <w:rPr>
           <w:sz w:val="24"/>
         </w:rPr>
         <w:t xml:space="preserve"> </w:t>
+      </w:r>
+      <w:r>
+        <w:rPr>
+          <w:sz w:val="23"/>
+        </w:rPr>
+        <w:t xml:space="preserve">Control Number: </w:t>
+      </w:r>
+      <w:r>
+        <w:rPr>
+          <w:b/>
+          <w:bCs/>
+          <w:sz w:val="23"/>
+        </w:rPr>
+        <w:t>{</w:t>
+      </w:r>
+      <w:proofErr w:type="spellStart"/>
+      <w:r>
+        <w:rPr>
+          <w:b/>
+          <w:bCs/>
+          <w:sz w:val="23"/>
+        </w:rPr>
+        <w:t>controlNumber</w:t>
+      </w:r>
+      <w:proofErr w:type="spellEnd"/>
+      <w:r>
+        <w:rPr>
+          <w:b/>
+          <w:bCs/>
+          <w:sz w:val="23"/>
+        </w:rPr>
+        <w:t>}</w:t>
       </w:r>
     </w:p>
     <w:p>

</xml_diff>